<commit_message>
feat: batch3 — sync W6-W18 workbooks (docx+pdf, batch2 rebuild)
</commit_message>
<xml_diff>
--- a/worksheets/W16.docx
+++ b/worksheets/W16.docx
@@ -2530,6 +2530,152 @@
     </w:tbl>
     <w:p>
       <w:pPr>
+        <w:keepNext/>
+        <w:keepLines w:val="0"/>
+        <w:spacing w:before="100" w:after="40" w:line="293" w:lineRule="auto"/>
+      </w:pPr>
+      <w:r>
+        <w:rPr>
+          <w:rFonts w:ascii="JetBrains Mono" w:hAnsi="JetBrains Mono" w:eastAsia="Arial Unicode MS"/>
+          <w:b/>
+          <w:i w:val="0"/>
+          <w:color w:val="1D4ED8"/>
+          <w:sz w:val="30"/>
+        </w:rPr>
+        <w:t>04</w:t>
+      </w:r>
+      <w:r>
+        <w:rPr>
+          <w:rFonts w:ascii="Arial Unicode MS" w:hAnsi="Arial Unicode MS" w:eastAsia="Arial Unicode MS"/>
+          <w:b w:val="0"/>
+          <w:i w:val="0"/>
+          <w:color w:val="1D4ED8"/>
+          <w:sz w:val="30"/>
+        </w:rPr>
+        <w:t xml:space="preserve">  </w:t>
+      </w:r>
+      <w:r>
+        <w:rPr>
+          <w:rFonts w:ascii="Arial Unicode MS" w:hAnsi="Arial Unicode MS" w:eastAsia="Arial Unicode MS"/>
+          <w:b/>
+          <w:i w:val="0"/>
+          <w:color w:val="1A2340"/>
+          <w:sz w:val="30"/>
+        </w:rPr>
+        <w:t>橋接欄｜收尾 30 秒，不評分</w:t>
+      </w:r>
+    </w:p>
+    <w:p>
+      <w:pPr>
+        <w:keepNext/>
+        <w:keepLines w:val="0"/>
+        <w:spacing w:before="0" w:after="20" w:line="293" w:lineRule="auto"/>
+      </w:pPr>
+      <w:r>
+        <w:rPr>
+          <w:rFonts w:ascii="Arial Unicode MS" w:hAnsi="Arial Unicode MS" w:eastAsia="Arial Unicode MS"/>
+          <w:b/>
+          <w:i w:val="0"/>
+          <w:color w:val="5B6573"/>
+          <w:sz w:val="22"/>
+        </w:rPr>
+        <w:t>不評分</w:t>
+      </w:r>
+      <w:r>
+        <w:rPr>
+          <w:rFonts w:ascii="Arial Unicode MS" w:hAnsi="Arial Unicode MS" w:eastAsia="Arial Unicode MS"/>
+          <w:b w:val="0"/>
+          <w:i w:val="0"/>
+          <w:color w:val="7B8491"/>
+          <w:sz w:val="22"/>
+        </w:rPr>
+        <w:t xml:space="preserve">  ｜  </w:t>
+      </w:r>
+      <w:r>
+        <w:rPr>
+          <w:rFonts w:ascii="Arial Unicode MS" w:hAnsi="Arial Unicode MS" w:eastAsia="Arial Unicode MS"/>
+          <w:b w:val="0"/>
+          <w:i w:val="0"/>
+          <w:color w:val="1A2340"/>
+          <w:sz w:val="22"/>
+        </w:rPr>
+        <w:t>這週的招，我在＿＿科的＿＿（單元／題型）用得上，因為＿＿。寫到具體單元／題型才算；想不到就寫「這週的招是＿＿」。</w:t>
+      </w:r>
+    </w:p>
+    <w:tbl>
+      <w:tblPr>
+        <w:tblW w:type="dxa" w:w="9865"/>
+        <w:jc w:val="left"/>
+        <w:tblLayout w:type="fixed"/>
+        <w:tblLook w:firstColumn="1" w:firstRow="1" w:lastColumn="0" w:lastRow="0" w:noHBand="0" w:noVBand="1" w:val="04A0"/>
+        <w:tblInd w:type="dxa" w:w="0"/>
+      </w:tblPr>
+      <w:tblGrid>
+        <w:gridCol w:w="9865"/>
+      </w:tblGrid>
+      <w:tr>
+        <w:trPr>
+          <w:trHeight w:val="437" w:hRule="atLeast"/>
+        </w:trPr>
+        <w:tc>
+          <w:tcPr>
+            <w:tcW w:type="dxa" w:w="9865"/>
+            <w:tcMar>
+              <w:top w:w="0" w:type="dxa"/>
+              <w:start w:w="0" w:type="dxa"/>
+              <w:bottom w:w="0" w:type="dxa"/>
+              <w:end w:w="0" w:type="dxa"/>
+            </w:tcMar>
+            <w:tcBorders>
+              <w:top w:val="nil"/>
+              <w:bottom w:val="single" w:sz="5" w:space="0" w:color="CBD5E1"/>
+              <w:start w:val="nil"/>
+              <w:end w:val="nil"/>
+            </w:tcBorders>
+          </w:tcPr>
+          <w:p>
+            <w:pPr>
+              <w:spacing w:before="0" w:after="0" w:line="240" w:lineRule="auto"/>
+            </w:pPr>
+            <w:r>
+              <w:t xml:space="preserve"> </w:t>
+            </w:r>
+          </w:p>
+        </w:tc>
+      </w:tr>
+      <w:tr>
+        <w:trPr>
+          <w:trHeight w:val="437" w:hRule="atLeast"/>
+        </w:trPr>
+        <w:tc>
+          <w:tcPr>
+            <w:tcW w:type="dxa" w:w="9865"/>
+            <w:tcMar>
+              <w:top w:w="0" w:type="dxa"/>
+              <w:start w:w="0" w:type="dxa"/>
+              <w:bottom w:w="0" w:type="dxa"/>
+              <w:end w:w="0" w:type="dxa"/>
+            </w:tcMar>
+            <w:tcBorders>
+              <w:top w:val="nil"/>
+              <w:bottom w:val="single" w:sz="5" w:space="0" w:color="CBD5E1"/>
+              <w:start w:val="nil"/>
+              <w:end w:val="nil"/>
+            </w:tcBorders>
+          </w:tcPr>
+          <w:p>
+            <w:pPr>
+              <w:spacing w:before="0" w:after="0" w:line="240" w:lineRule="auto"/>
+            </w:pPr>
+            <w:r>
+              <w:t xml:space="preserve"> </w:t>
+            </w:r>
+          </w:p>
+        </w:tc>
+      </w:tr>
+    </w:tbl>
+    <w:p>
+      <w:pPr>
         <w:spacing w:after="0"/>
       </w:pPr>
       <w:r>

</xml_diff>